<commit_message>
Wire scripts and docs to organized layout
</commit_message>
<xml_diff>
--- a/docs/agenda/TECHWEEK_AGENDA.docx
+++ b/docs/agenda/TECHWEEK_AGENDA.docx
@@ -1498,7 +1498,7 @@
           <w:sz-cs w:val="26"/>
           <w:spacing w:val="0"/>
         </w:rPr>
-        <w:t xml:space="preserve">python3 check_techweek_acceptance_emails.py</w:t>
+        <w:t xml:space="preserve">python3 scripts/check_techweek_acceptance_emails.py</w:t>
       </w:r>
     </w:p>
     <w:p>
@@ -6142,7 +6142,7 @@
           <w:sz-cs w:val="26"/>
           <w:spacing w:val="0"/>
         </w:rPr>
-        <w:t xml:space="preserve">techweek_signed_up_transport_schedule.md</w:t>
+        <w:t xml:space="preserve">outputs/signed_up/techweek_signed_up_transport_schedule.md</w:t>
       </w:r>
       <w:r>
         <w:rPr>
@@ -6177,7 +6177,7 @@
           <w:sz-cs w:val="26"/>
           <w:spacing w:val="0"/>
         </w:rPr>
-        <w:t xml:space="preserve">techweek_signed_up_transport_schedule.csv</w:t>
+        <w:t xml:space="preserve">outputs/signed_up/techweek_signed_up_transport_schedule.csv</w:t>
       </w:r>
       <w:r>
         <w:rPr>
@@ -6212,7 +6212,7 @@
           <w:sz-cs w:val="26"/>
           <w:spacing w:val="0"/>
         </w:rPr>
-        <w:t xml:space="preserve">techweek_signed_up_operational_with_travel.ics</w:t>
+        <w:t xml:space="preserve">outputs/signed_up/techweek_signed_up_operational_with_travel.ics</w:t>
       </w:r>
       <w:r>
         <w:rPr>
@@ -6247,7 +6247,7 @@
           <w:sz-cs w:val="26"/>
           <w:spacing w:val="0"/>
         </w:rPr>
-        <w:t xml:space="preserve">techweek_signed_up_all_rsvps_reference.ics</w:t>
+        <w:t xml:space="preserve">outputs/signed_up/techweek_signed_up_all_rsvps_reference.ics</w:t>
       </w:r>
       <w:r>
         <w:rPr>
@@ -6317,7 +6317,7 @@
           <w:sz-cs w:val="26"/>
           <w:spacing w:val="0"/>
         </w:rPr>
-        <w:t xml:space="preserve">SIGNUP_STATE_HANDOFF.md</w:t>
+        <w:t xml:space="preserve">docs/handoffs/SIGNUP_STATE_HANDOFF.md</w:t>
       </w:r>
       <w:r>
         <w:rPr>

</xml_diff>